<commit_message>
docs: tighten Haidian GEP pilot scope and validation
</commit_message>
<xml_diff>
--- a/docs/projects/haidian_gep_xuannv_application_revision_20260729_zh.docx
+++ b/docs/projects/haidian_gep_xuannv_application_revision_20260729_zh.docx
@@ -13,7 +13,7 @@
           <w:b/>
           <w:sz w:val="32"/>
         </w:rPr>
-        <w:t>基于玄女月度地理嵌入的海淀区生态系统生产总值（GEP）核算与智能服务关键技术研究</w:t>
+        <w:t>基于玄女月度地理嵌入的海淀区生态系统生产总值（GEP）核算技术试点与智能服务研究</w:t>
       </w:r>
     </w:p>
     <w:p>
@@ -97,7 +97,7 @@
                 <w:b w:val="0"/>
                 <w:sz w:val="21"/>
               </w:rPr>
-              <w:t>基于玄女月度地理嵌入的海淀区生态系统生产总值（GEP）核算与智能服务关键技术研究</w:t>
+              <w:t>基于玄女月度地理嵌入的海淀区生态系统生产总值（GEP）核算技术试点与智能服务研究</w:t>
             </w:r>
           </w:p>
         </w:tc>
@@ -229,7 +229,7 @@
                 <w:b w:val="0"/>
                 <w:sz w:val="21"/>
               </w:rPr>
-              <w:t>待填</w:t>
+              <w:t>建议2年（以正式立项文件为准）</w:t>
             </w:r>
           </w:p>
         </w:tc>
@@ -308,7 +308,7 @@
           <w:b w:val="0"/>
           <w:sz w:val="24"/>
         </w:rPr>
-        <w:t>本项目面向海淀区生态系统生产总值（GEP）核算中遥感数据分散、生态状态更新不及时、模型与核算口径脱节、结果难以追溯等问题，拟在现有“玄女”月度地理嵌入底座基础上，建设“10米月度生态证据层—生态服务实物量反演—标准化价值量核算—可信智能服务”的技术链条。玄女模型以1,280米×1,280米地面范围组织训练与推理，每个patch输出128×128×64的稠密嵌入图，实际对应10米×10米空间网格；1,280米仅为切片范围，不是最终产品分辨率。本项目以GB/T 46869—2025为核算依据，优先开展固碳、雨洪调蓄和城市热环境调节三类服务示范，并在数据条件具备时扩展水质净化、土壤保持和游憩服务。模型不直接预测货币化GEP，而是提供可复用的月度生态状态表征，结合生态过程模型、监测资料、统计资料和标准参数完成实物量、价值量及总值核算，形成可审计、可复算、可交互的海淀区示范成果。</w:t>
+        <w:t>本项目面向海淀区GEP核算中数据分散、生态状态更新不及时和结果难以追溯等问题，建设“10米月度生态证据层—服务实物量反演—标准化价值量核算—可信服务”链条。玄女以1,280米×1,280米范围组织训练，每个patch输出128×128×64稠密embedding，实际对应10米网格，1,280米不是产品分辨率。项目依据GB/T 46869—2025，先开展固碳、洪水调蓄、局部气候调节三类调节服务价值试点；模型不直接预测货币，实物量和价值量由生态过程模型、监测资料、统计资料与标准参数共同核算，形成可追溯、可复算的示范成果。</w:t>
       </w:r>
     </w:p>
     <w:p>
@@ -348,7 +348,7 @@
           <w:b w:val="0"/>
           <w:sz w:val="24"/>
         </w:rPr>
-        <w:t>建立以10米月度生态状态嵌入为证据层、以GB/T 46869—2025核算流程为约束的海淀区GEP技术体系。项目重点不是用人工智能端到端“预测人民币”，而是提高生态状态制图、服务实物量反演、数据对齐和过程调度的效率，使每项核算结果均可追溯到影像、模型、参数和统计资料。</w:t>
+        <w:t>建立以10米月度生态状态embedding为证据层、以GB/T 46869—2025核算流程为约束的海淀区GEP核算技术试点。项目重点不是用人工智能端到端“预测人民币”，而是提高生态状态制图、服务实物量反演、数据对齐和过程调度的效率，使每项核算结果均可追溯到影像、模型、参数和统计资料。</w:t>
       </w:r>
     </w:p>
     <w:p>
@@ -375,7 +375,7 @@
           <w:b w:val="0"/>
           <w:sz w:val="24"/>
         </w:rPr>
-        <w:t>现有GEP工作通常需要人工整合遥感影像、生态模型、统计年鉴、价格参数和监测数据。不同来源的分辨率、时间和空间参考不一致，导致结果更新慢、复算成本高。海淀区城市建设用地、河湖湿地、山地林地和公园绿地交错，生态服务具有显著空间异质性，需要比传统粗分辨率产品更细的空间证据。10米月度嵌入能够持续描述植被、水体、不透水面、建设活动和季节性状态，为服务实物量计算提供统一的空间底图。</w:t>
+        <w:t>现有GEP工作需要人工整合遥感影像、生态模型、统计年鉴、价格参数和监测资料。不同来源的分辨率、时间和空间参考不一致，导致更新慢、复算成本高。海淀区建设用地、河湖湿地、山地林地和公园绿地交错，生态服务具有显著空间异质性，需要更精细且可持续更新的空间证据。</w:t>
       </w:r>
     </w:p>
     <w:p>
@@ -402,7 +402,7 @@
           <w:b w:val="0"/>
           <w:sz w:val="24"/>
         </w:rPr>
-        <w:t>项目已有玄女海淀月度嵌入底座作为起点。现有生产模型对每个1,280米×1,280米patch输出128×128×64 embedding map，提供10米空间网格、64维语义表征和月度产品能力；在建筑、道路、水体等少样本制图任务上已完成验证。这些成果证明模型具备地表状态表达和快速适配能力，但尚不代表已经具备GEP核算能力。本项目将在此基础上补充DEM、气象、土壤、水文、地表温度、生态统计和监测资料，并以生态过程模型和国家标准完成实物量及价值量核算。</w:t>
+        <w:t>项目已有玄女海淀月度embedding底座作为起点。P10C生产权重覆盖2025年12月至2026年5月、320个patch；对每个1,280米×1,280米patch输出128×128×64 embedding map，提供10米输出网格和64维表征。建筑、道路、水体仅在与预训练OSM弱语义同源的少样本基准上完成初步评测，尚未完成独立人工标注、生态监测或GEP服务变量验证。本项目将在此基础上补充DEM、气象、土壤、水文、地表温度、生态统计和监测资料，以生态过程模型和国家标准完成服务实物量及价值量试点核算。</w:t>
       </w:r>
     </w:p>
     <w:p>
@@ -442,7 +442,7 @@
           <w:b w:val="0"/>
           <w:sz w:val="24"/>
         </w:rPr>
-        <w:t>构建海淀区10米月度生态证据层和标准化GEP核算原型，形成从多源数据对齐、嵌入生成、生态服务实物量反演、价值量核算到可信问答的完整流程。</w:t>
+        <w:t>构建海淀区10米月度生态证据层和三类调节服务的标准化核算原型，形成从多源数据对齐、embedding生成、生态服务实物量反演、价值量核算到可信问答的完整流程。</w:t>
       </w:r>
     </w:p>
     <w:p>
@@ -497,7 +497,7 @@
           <w:b w:val="0"/>
           <w:sz w:val="24"/>
         </w:rPr>
-        <w:t>3. 完成固碳、雨洪调蓄、城市热环境调节三类核心服务的实物量反演与价值量核算原型；水质净化、土壤保持、游憩服务仅在获得相应污染源、水质、土壤或客流资料并完成独立验证后纳入扩展核算。</w:t>
+        <w:t>3. 完成固定二氧化碳、洪水调蓄、局部气候调节三类服务的实物量反演与价值量核算原型；其合计明确表述为“三类调节服务价值试点合计”，不等同于海淀区完整GEP总值。水质净化、土壤保持、游憩和物质产品仅在形成适用清单、取得资料并完成独立验证后纳入扩展核算。</w:t>
       </w:r>
     </w:p>
     <w:p>
@@ -511,7 +511,7 @@
           <w:b w:val="0"/>
           <w:sz w:val="24"/>
         </w:rPr>
-        <w:t>4. 对分类任务报告F1、IoU和总体精度；对连续生态变量报告R²、MAE、RMSE和Bias；对雨洪类过程报告NSE、KGE、PBIAS或事件命中率。各指标均使用空间分块、时间留出或独立监测资料验证，不使用训练标签直接评价。</w:t>
+        <w:t>4. 核算开始前固定边界版本、核算基准年、服务清单、数据来源、基线方法、独立验证资料和验收判定规则。对分类任务报告F1、IoU和总体精度；对连续生态变量报告R²、MAE、RMSE和Bias；对雨洪过程报告NSE、KGE、PBIAS和事件命中率。各指标均采用空间分块、时间留出或独立监测资料验证，校准资料与最终评价资料隔离。</w:t>
       </w:r>
     </w:p>
     <w:p>
@@ -526,6 +526,33 @@
           <w:sz w:val="24"/>
         </w:rPr>
         <w:t>5. 建成可调用的GEP核算工具链和问答原型。问答结果必须返回数据时间、空间范围、模型版本、参数版本、核算方法和不确定性说明；未完成核算的数据不得生成定量结论。</w:t>
+      </w:r>
+    </w:p>
+    <w:p>
+      <w:pPr>
+        <w:spacing w:before="160" w:after="80"/>
+      </w:pPr>
+      <w:r>
+        <w:rPr>
+          <w:rFonts w:ascii="Times New Roman" w:hAnsi="Times New Roman" w:eastAsia="宋体"/>
+          <w:b/>
+          <w:sz w:val="24"/>
+        </w:rPr>
+        <w:t>3. 试点边界与完整GEP的关系</w:t>
+      </w:r>
+    </w:p>
+    <w:p>
+      <w:pPr>
+        <w:spacing w:after="100" w:line="360" w:lineRule="auto"/>
+        <w:ind w:firstLine="420"/>
+      </w:pPr>
+      <w:r>
+        <w:rPr>
+          <w:rFonts w:ascii="Times New Roman" w:hAnsi="Times New Roman" w:eastAsia="宋体"/>
+          <w:b w:val="0"/>
+          <w:sz w:val="24"/>
+        </w:rPr>
+        <w:t>本项目首期交付的是三类调节服务价值试点，不以其合计替代完整GEP。完整GEP需先按GB/T 46869—2025编制海淀区生态产品清单，说明物质产品、调节服务、文化服务的纳入或排除依据，并采用“区域内生态产品价值合计－来自区域外的生态产品价值”规则进行汇总。项目将建立该清单、扣减字段和审计规则；只有在适用科目、数据、参数及独立验证齐备后，才形成完整GEP总值。</w:t>
       </w:r>
     </w:p>
     <w:p>
@@ -565,7 +592,7 @@
           <w:b w:val="0"/>
           <w:sz w:val="24"/>
         </w:rPr>
-        <w:t>建立统一的10米分析网格和数据目录。10米网格是生态状态和embedding产品的表达网格，不意味着所有输入资料原始分辨率均为10米。对于较粗的气象、土壤、DEM、统计和生态产品，保存其原始空间分辨率、时间范围与重采样方法，避免把插值结果误表述为新增的10米观测事实。</w:t>
+        <w:t>建立统一的10米分析网格和数据目录。10米网格是生态状态和embedding产品的表达网格，不意味着所有输入资料原始分辨率均为10米。每个产品必须标明其属性：原始观测、重采样辅助变量或模型推断结果。对于较粗的气象、土壤、DEM、统计和生态产品，保存原始空间分辨率、时间范围与重采样方法，避免把插值结果误表述为新增的10米观测事实。</w:t>
       </w:r>
     </w:p>
     <w:p>
@@ -607,7 +634,7 @@
           <w:b w:val="0"/>
           <w:sz w:val="24"/>
         </w:rPr>
-        <w:t>2. 生态状态层。包括生态系统类型、植被覆盖度、土地覆盖、地表温度、水体、绿地、不透水面及由embedding支持的变化信息。</w:t>
+        <w:t>2. 生态状态层。形成与GB/T 46869—2025附录B生态系统分类相衔接的森林、灌丛、草地、湿地、农田和城市生态系统分类；城市生态系统进一步记录城市绿地、城市水体、居住地、工矿交通等子类。对分类图开展面积闭合、边界像元与混合像元处理，并使用独立样本评价。植被覆盖度、地表温度、热环境和变化图均属于本项目拟由专用头和外部资料生成的产品，不作为现有P10C已交付能力表述。</w:t>
       </w:r>
     </w:p>
     <w:p>
@@ -662,7 +689,7 @@
           <w:b w:val="0"/>
           <w:sz w:val="24"/>
         </w:rPr>
-        <w:t>以玄女海淀P10C生产模型为初始化底座，保持其多源遥感输入、月度输出、128×128空间网格和64维稠密embedding能力。模型以六个月时序上下文生成对应月份的嵌入，因此应表述为“月度输出、具有时序上下文”，而非“每月只使用单月影像”。</w:t>
+        <w:t>以玄女海淀P10C生产模型为初始化底座，保持其多源遥感输入、月度输出、128×128空间网格和64维稠密embedding能力。模型以六个月时序上下文生成对应月份的嵌入，因此应表述为“月度输出、具有时序上下文”，而非“每月只使用单月影像”。项目启动时需定义月产品采用回看窗口、居中窗口或其他规则，明确最短出具滞后、首尾月份处理、云缺失阈值和降级策略。</w:t>
       </w:r>
     </w:p>
     <w:p>
@@ -690,7 +717,7 @@
           <w:b w:val="0"/>
           <w:sz w:val="24"/>
         </w:rPr>
-        <w:t>模型每月输出10米生态embedding和相应质量信息。高分影像只在与目标月份时相匹配且质量合格时参与融合；当某月没有同期高分观测时，应明确记录可用性，不以相邻月份影像替代为“同期观测”。</w:t>
+        <w:t>现有P10C导出结果为embedding及其全局元数据，不直接输出逐patch、逐月质量信息或生态状态图；现有高分源还采用跨可用时相汇聚后逐月重复融合，不能称为同期高分观测。项目拟改造为按目标月匹配的高分融合，并发布独立的月度产品包：embedding、输入可用性、云/阴影等质量掩膜、源数据日期、空间参考、处理版本和不确定性字段。无同期高分观测时应按规则降级并记录，不以相邻月份影像冒充同期观测。</w:t>
       </w:r>
     </w:p>
     <w:p>
@@ -717,7 +744,7 @@
           <w:b w:val="0"/>
           <w:sz w:val="24"/>
         </w:rPr>
-        <w:t>按照GB/T 46869—2025，GEP核算应依次完成核算区域与生态系统类型确定、生态产品清单确定、数据收集、实物量核算、价值量核算和总值汇总。玄女embedding的角色是提高生态状态表达与空间细化能力，不取代生态过程模型、标准公式、统计口径和价值参数。</w:t>
+        <w:t>按照GB/T 46869—2025，GEP核算应依次完成核算区域与生态系统类型确定、生态产品清单确定、数据收集、实物量核算、价值量核算和总值汇总。正式核算前锁定自然年或明确核算期、行政边界版本、边界像元归属和水体范围；月度embedding只作为状态证据，不能把月度存量或状态简单累加为年度实物量。玄女embedding的角色是提高生态状态表达与空间细化能力，不取代生态过程模型、标准公式、统计口径和价值参数。</w:t>
       </w:r>
     </w:p>
     <w:p>
@@ -745,7 +772,7 @@
           <w:b w:val="0"/>
           <w:sz w:val="24"/>
         </w:rPr>
-        <w:t>1. 固碳服务模块。以10米植被和生态状态证据辅助NPP/生物量空间化，结合光能利用率模型、气象资料和必要的样地/清查资料计算固碳实物量，再按标准确定价值量。</w:t>
+        <w:t>1. 固碳服务模块。实物量口径为固定二氧化碳量（tCO2/a）。以10米生态状态证据辅助植被类型与空间化，但不把NPP直接等同于净碳汇；优先采用经呼吸项校正的NEP或经验证的固碳速率/生物量变化法。若仅具备NPP，只能作为过程代理变量，不进入正式固碳价值量。不同生态系统类型分别建模，避免重复计量；价值参数明确碳价或替代成本、适用年份、折算方法和版本。</w:t>
       </w:r>
     </w:p>
     <w:p>
@@ -759,7 +786,7 @@
           <w:b w:val="0"/>
           <w:sz w:val="24"/>
         </w:rPr>
-        <w:t>2. 雨洪调蓄服务模块。以不透水面、绿地、水体和地形为精细空间证据，结合降雨、土壤、水文边界和子汇水区，使用适用的水文或InVEST类模型计算调蓄实物量。水文过程先在子汇水区或明确的排水单元计算，再汇总到海淀区，不能把像元结果简单相加。</w:t>
+        <w:t>2. 洪水调蓄服务模块。实物量口径为调蓄水量（m3/a）。以不透水面、绿地、水体和地形为精细空间证据，结合降雨、土壤、管网边界、排水分区和子汇水区，采用明确的水文模型计算。项目启动时固定设计暴雨情景、重现期、汇流边界和基础设施边界；模型须通过水量平衡、参数本地化和径流/积水资料验证。水文过程先在子汇水区或明确的排水单元计算，再汇总到海淀区，不能把像元结果简单相加。价值参数采用单位库容建设与运维替代成本，记录来源、价格年份和适用范围。</w:t>
       </w:r>
     </w:p>
     <w:p>
@@ -773,7 +800,21 @@
           <w:b w:val="0"/>
           <w:sz w:val="24"/>
         </w:rPr>
-        <w:t>3. 城市热环境调节模块。以地表温度、植被、水体、不透水面、建筑环境和气象资料识别热环境状态，构建降温效应或热暴露缓解的实物量评价，并明确服务对象、时间尺度和价值参数。</w:t>
+        <w:t>3. 局部气候调节模块。以蒸散发调节温湿度所消耗的能量作为正式实物量口径，结合地表温度、植被、水体、不透水面、建筑环境和气象资料计算。采用明确的基准情景，区分地表温度、近地气温与热暴露；热暴露缓解作为补充效益，不能替代正式实物量。价值量按当地生活电价及替代制冷能耗核算，并记录服务对象、受益范围、价格年份和参数版本。</w:t>
+      </w:r>
+    </w:p>
+    <w:p>
+      <w:pPr>
+        <w:spacing w:after="100" w:line="360" w:lineRule="auto"/>
+        <w:ind w:firstLine="420"/>
+      </w:pPr>
+      <w:r>
+        <w:rPr>
+          <w:rFonts w:ascii="Times New Roman" w:hAnsi="Times New Roman" w:eastAsia="宋体"/>
+          <w:b w:val="0"/>
+          <w:sz w:val="24"/>
+        </w:rPr>
+        <w:t>每项服务均建立“供给区—受益对象—受益区—核算归属”表。跨街道、跨行政区和跨汇水区服务按预先确定的规则分摊；完整GEP汇总时单列区域外生态产品价值扣减，防止重复计量。</w:t>
       </w:r>
     </w:p>
     <w:p>
@@ -856,7 +897,7 @@
           <w:b w:val="0"/>
           <w:sz w:val="24"/>
         </w:rPr>
-        <w:t>3. GEP核算与决策产品。形成符合标准口径的生态产品清单、实物量表、价值量表、总值表、不确定性说明和方法附件；对于条件不足的服务项目，明确列为“待补数据/待验证”，不纳入正式总值。</w:t>
+        <w:t>3. GEP核算与决策产品。形成三类调节服务价值试点表、完整GEP生态产品清单草案、逐科目实物量—单位—价值量—单位—方法—数据来源附表、区域外价值扣减字段、参数台账和不确定性说明。对条件不足的服务项目明确列为“待补数据/待验证”，不纳入三类试点合计，更不纳入完整GEP总值。</w:t>
       </w:r>
     </w:p>
     <w:p>
@@ -1004,7 +1045,7 @@
           <w:b w:val="0"/>
           <w:sz w:val="24"/>
         </w:rPr>
-        <w:t>将玄女稠密月度embedding作为生态状态证据层，服务于生态系统类型、植被、水体、不透水面和热环境等精细空间表达；同时保持GEP实物量和价值量核算遵循标准与过程模型，不混淆“表征分辨率”和“核算口径”。</w:t>
+        <w:t>将玄女稠密月度embedding作为生态状态证据层，服务于生态系统类型、植被、水体、不透水面和热环境等精细空间表达；同时保持GEP实物量和价值量核算遵循标准与过程模型，不混淆“表征分辨率”和“核算口径”。该项属于应用与工程创新，不把10米embedding误述为10米原始生态观测。</w:t>
       </w:r>
     </w:p>
     <w:p>
@@ -1031,7 +1072,7 @@
           <w:b w:val="0"/>
           <w:sz w:val="24"/>
         </w:rPr>
-        <w:t>在通用多源遥感表征基础上，加入质量感知、地形和气象等生态辅助信息，通过轻量适配支持多类服务实物量反演，降低每个服务重复训练独立大模型的成本。</w:t>
+        <w:t>在通用多源遥感表征基础上，加入质量感知、地形和气象等生态辅助信息，研究“冻结底座＋生态适配器＋服务轻量头＋过程模型”的协同方式。通过与仅使用原始影像、仅使用embedding轻量头和全监督任务模型的对比及消融，检验生态适配器、质量信息和过程约束的实际贡献。</w:t>
       </w:r>
     </w:p>
     <w:p>
@@ -1098,7 +1139,7 @@
           <w:b w:val="0"/>
           <w:sz w:val="24"/>
         </w:rPr>
-        <w:t>1. 海淀区10米月度生态证据产品和数据字典，包括embedding、质量掩膜、生态状态图和数据血缘信息。</w:t>
+        <w:t>1. 海淀区10米月度生态证据产品和数据字典，包括embedding、质量掩膜、生态状态图和数据血缘信息。现有P10C结果将作为基线；逐patch、逐月质量元数据和生态状态图为本项目新增交付。</w:t>
       </w:r>
     </w:p>
     <w:p>
@@ -1126,7 +1167,7 @@
           <w:b w:val="0"/>
           <w:sz w:val="24"/>
         </w:rPr>
-        <w:t>3. 固碳、雨洪调蓄、城市热环境调节三类服务的实物量反演及价值量核算原型；扩展服务的条件说明与验证报告。</w:t>
+        <w:t>3. 固定二氧化碳、洪水调蓄、局部气候调节三类服务的实物量反演及价值量核算原型，成果名称为“三类调节服务价值试点”；扩展服务的纳入条件、数据缺口和验证报告。</w:t>
       </w:r>
     </w:p>
     <w:p>
@@ -1154,7 +1195,7 @@
           <w:b w:val="0"/>
           <w:sz w:val="24"/>
         </w:rPr>
-        <w:t>5. 海淀区应用示范报告，包含生态产品清单、实物量、价值量、总值、不确定性和方法说明。</w:t>
+        <w:t>5. 海淀区应用示范报告，包含生态产品清单草案、三类试点实物量与价值量、区域外价值扣减规则、不确定性和方法说明。完整GEP总值仅在全部适用科目满足标准数据与验证条件时另行核算。</w:t>
       </w:r>
     </w:p>
     <w:p>
@@ -1181,7 +1222,7 @@
           <w:b w:val="0"/>
           <w:sz w:val="24"/>
         </w:rPr>
-        <w:t>所有成果的空间分辨率、时间范围、资料来源、模型版本和适用条件应在产品说明中明确。对结果精度不预设缺乏依据的统一阈值；在项目启动阶段完成基线、独立验证资料和验收指标确认后，按服务类型报告指标。分类、连续变量和水文过程分别采用对应指标，不以单一R²或单一总体精度替代全过程评价。</w:t>
+        <w:t>所有成果的空间分辨率、时间范围、资料来源、模型版本和适用条件应在产品说明中明确。立项后第2个月完成并冻结《核算边界、样本与验收方案》：分类产品按不少于5个空间块进行留出评价；连续变量按独立站点/样地和时间留出评价；洪水调蓄按预先选定的降雨事件或年度径流资料评价。每项服务均明确验证数据、校准/评价隔离、基线方法、合格判定、不确定性来源和复核责任。分类、连续变量和水文过程分别采用对应指标，不以单一R²或单一总体精度替代全过程评价。</w:t>
       </w:r>
     </w:p>
     <w:p>
@@ -1248,7 +1289,7 @@
           <w:b w:val="0"/>
           <w:sz w:val="24"/>
         </w:rPr>
-        <w:t>玄女海淀生产模型已形成月度多源遥感embedding能力：输入由Sentinel-2、Sentinel-1、Landsat、高分光学和高分SAR等组成；输出为128×128×64的10米稠密embedding map。现有评测表明，该embedding可以支持建筑、道路、水体等少样本制图任务，适合作为本项目的生态状态证据底座。</w:t>
+        <w:t>玄女海淀P10C生产模型已形成月度多源遥感embedding能力：输入由Sentinel-2、Sentinel-1、Landsat、高分光学和高分SAR等组成；在2025年12月至2026年5月、320个patch范围内输出128×128×64的10米稠密embedding map。现有建筑、道路、水体结果来自与预训练OSM弱语义同源的少样本基准，说明其具有地表表征和快速适配潜力，但不能作为独立生态服务反演精度或GEP核算能力的证据。</w:t>
       </w:r>
     </w:p>
     <w:p>
@@ -1301,7 +1342,7 @@
           <w:b/>
           <w:sz w:val="24"/>
         </w:rPr>
-        <w:t>1. 第一阶段：数据与口径确认</w:t>
+        <w:t>1. 第一阶段：数据、边界与核算口径确认（第1—2个月）</w:t>
       </w:r>
     </w:p>
     <w:p>
@@ -1315,7 +1356,7 @@
           <w:b w:val="0"/>
           <w:sz w:val="24"/>
         </w:rPr>
-        <w:t>明确核算区域、核算期、生态系统类型、服务清单、数据来源、空间参考、10米网格、质量控制规则和独立验证方案；建立数据台账与版本管理。</w:t>
+        <w:t>锁定核算基准年/核算期、海淀区行政边界版本、边界像元归属、生态系统分类、服务清单、数据来源、10米网格和质量控制规则；完成《核算边界、样本与验收方案》。若关键气象、水文、生态监测或价格资料无法取得，则触发Go/No-Go评审：缩减至具备资料的服务模块，不发布相应价值量。</w:t>
       </w:r>
     </w:p>
     <w:p>
@@ -1328,7 +1369,7 @@
           <w:b/>
           <w:sz w:val="24"/>
         </w:rPr>
-        <w:t>2. 第二阶段：embedding生态适配与实物量模型开发</w:t>
+        <w:t>2. 第二阶段：生态证据与服务实物量模型开发（第3—12个月）</w:t>
       </w:r>
     </w:p>
     <w:p>
@@ -1342,7 +1383,7 @@
           <w:b w:val="0"/>
           <w:sz w:val="24"/>
         </w:rPr>
-        <w:t>完成月度生态证据产品生成，研发固碳、雨洪调蓄和热环境调节服务模块，形成空间分块和时间留出的验证流程。</w:t>
+        <w:t>完成月度生态证据产品包、按目标月匹配的高分融合改造、生态分类与数据台账；研发固定二氧化碳、洪水调蓄和局部气候调节模块，完成原始影像、embedding和过程模型的对比及空间分块、时间留出验证。</w:t>
       </w:r>
     </w:p>
     <w:p>
@@ -1355,7 +1396,7 @@
           <w:b/>
           <w:sz w:val="24"/>
         </w:rPr>
-        <w:t>3. 第三阶段：价值量核算、智能服务与示范验收</w:t>
+        <w:t>3. 第三阶段：价值量试点与可信服务原型（第13—18个月）</w:t>
       </w:r>
     </w:p>
     <w:p>
@@ -1369,7 +1410,34 @@
           <w:b w:val="0"/>
           <w:sz w:val="24"/>
         </w:rPr>
-        <w:t>依据标准完成实物量和价值量核算，构建可信问答原型，输出海淀区示范专题图、核算表、方法报告和不确定性报告。</w:t>
+        <w:t>完成三类服务的参数本地化、价值量计算、受益边界和区域外价值扣减规则；生成标准附录D、E所需的报告和表格字段，构建可追溯问答原型。</w:t>
+      </w:r>
+    </w:p>
+    <w:p>
+      <w:pPr>
+        <w:spacing w:before="160" w:after="80"/>
+      </w:pPr>
+      <w:r>
+        <w:rPr>
+          <w:rFonts w:ascii="Times New Roman" w:hAnsi="Times New Roman" w:eastAsia="宋体"/>
+          <w:b/>
+          <w:sz w:val="24"/>
+        </w:rPr>
+        <w:t>4. 第四阶段：示范验收与成果固化（第19—24个月）</w:t>
+      </w:r>
+    </w:p>
+    <w:p>
+      <w:pPr>
+        <w:spacing w:after="100" w:line="360" w:lineRule="auto"/>
+        <w:ind w:firstLine="420"/>
+      </w:pPr>
+      <w:r>
+        <w:rPr>
+          <w:rFonts w:ascii="Times New Roman" w:hAnsi="Times New Roman" w:eastAsia="宋体"/>
+          <w:b w:val="0"/>
+          <w:sz w:val="24"/>
+        </w:rPr>
+        <w:t>完成独立复核、不确定性与敏感性分析、示范专题图、数据字典、方法报告和部署文档。项目负责人、数据工程、生态核算、模型研发和平台研发的具体人员及经费由申报单位在正式表格中补充，不在本技术稿中虚构。</w:t>
       </w:r>
     </w:p>
     <w:p>

</xml_diff>

<commit_message>
docs: define GEP pilot acceptance gates and methods
</commit_message>
<xml_diff>
--- a/docs/projects/haidian_gep_xuannv_application_revision_20260729_zh.docx
+++ b/docs/projects/haidian_gep_xuannv_application_revision_20260729_zh.docx
@@ -511,7 +511,7 @@
           <w:b w:val="0"/>
           <w:sz w:val="24"/>
         </w:rPr>
-        <w:t>4. 核算开始前固定边界版本、核算基准年、服务清单、数据来源、基线方法、独立验证资料和验收判定规则。对分类任务报告F1、IoU和总体精度；对连续生态变量报告R²、MAE、RMSE和Bias；对雨洪过程报告NSE、KGE、PBIAS和事件命中率。各指标均采用空间分块、时间留出或独立监测资料验证，校准资料与最终评价资料隔离。</w:t>
+        <w:t>4. 示范核算基准年暂定为2026自然年；若立项后数据核查表明该年关键资料不可得，须经项目管理方书面批准后调整基准年，不得自行变更。项目覆盖该自然年12期月度产品，月度质量不足的像元显式标记为无数据，不以插补结果冒充观测。对分类任务报告F1、IoU和总体精度；对连续生态变量报告R²、MAE、RMSE和Bias；对雨洪过程报告NSE、KGE、PBIAS和事件命中率。各指标均采用空间分块、时间留出或独立监测资料验证，校准资料与最终评价资料隔离。</w:t>
       </w:r>
     </w:p>
     <w:p>
@@ -538,7 +538,48 @@
           <w:b/>
           <w:sz w:val="24"/>
         </w:rPr>
-        <w:t>3. 试点边界与完整GEP的关系</w:t>
+        <w:t>3. 核心服务数据门槛与验收底线</w:t>
+      </w:r>
+    </w:p>
+    <w:p>
+      <w:pPr>
+        <w:spacing w:after="100" w:line="360" w:lineRule="auto"/>
+        <w:ind w:firstLine="420"/>
+      </w:pPr>
+      <w:r>
+        <w:rPr>
+          <w:rFonts w:ascii="Times New Roman" w:hAnsi="Times New Roman" w:eastAsia="宋体"/>
+          <w:b w:val="0"/>
+          <w:sz w:val="24"/>
+        </w:rPr>
+        <w:t>固定二氧化碳、洪水调蓄和局部气候调节均为项目必做模块，不允许因资料缺失自动缩减。第2个月的数据核查必须确认：固碳模块具备生态系统类型、气象、样地/清查或同等独立资料；洪水模块具备降雨、DEM、土壤、排水/汇水边界及不少于3场独立降雨—径流或积水事件资料；局部气候模块具备地表温度、气象、植被/不透水面资料和不少于3个季节的独立温湿度或能耗验证资料。资料不能满足时，项目管理方须作出“补充数据后继续”或“书面调整任务及验收”的决策，不能以无验证结果的价值量替代交付。</w:t>
+      </w:r>
+    </w:p>
+    <w:p>
+      <w:pPr>
+        <w:spacing w:after="100" w:line="360" w:lineRule="auto"/>
+        <w:ind w:firstLine="420"/>
+      </w:pPr>
+      <w:r>
+        <w:rPr>
+          <w:rFonts w:ascii="Times New Roman" w:hAnsi="Times New Roman" w:eastAsia="宋体"/>
+          <w:b w:val="0"/>
+          <w:sz w:val="24"/>
+        </w:rPr>
+        <w:t>验收时，生态分类使用不少于5个空间分块的独立留出评价；连续变量每个服务模块至少使用30条独立观测或样地记录，并报告空间/时间代表性；洪水模块至少报告3场独立事件及年度水量平衡。每个产品必须覆盖经批准的基准年、保留100%完整的数据血缘字段；每项服务均与预先登记的传统过程模型或原始影像基线比较。数据不足时可交付“数据缺口与方法验证报告”，但不得命名为该服务的正式价值量成果。</w:t>
+      </w:r>
+    </w:p>
+    <w:p>
+      <w:pPr>
+        <w:spacing w:before="160" w:after="80"/>
+      </w:pPr>
+      <w:r>
+        <w:rPr>
+          <w:rFonts w:ascii="Times New Roman" w:hAnsi="Times New Roman" w:eastAsia="宋体"/>
+          <w:b/>
+          <w:sz w:val="24"/>
+        </w:rPr>
+        <w:t>4. 试点边界与完整GEP的关系</w:t>
       </w:r>
     </w:p>
     <w:p>
@@ -772,7 +813,7 @@
           <w:b w:val="0"/>
           <w:sz w:val="24"/>
         </w:rPr>
-        <w:t>1. 固碳服务模块。实物量口径为固定二氧化碳量（tCO2/a）。以10米生态状态证据辅助植被类型与空间化，但不把NPP直接等同于净碳汇；优先采用经呼吸项校正的NEP或经验证的固碳速率/生物量变化法。若仅具备NPP，只能作为过程代理变量，不进入正式固碳价值量。不同生态系统类型分别建模，避免重复计量；价值参数明确碳价或替代成本、适用年份、折算方法和版本。</w:t>
+        <w:t>1. 固碳服务模块。实物量口径为固定二氧化碳量（tCO2/a）。以10米生态状态证据辅助植被类型与空间化，但不把NPP直接等同于净碳汇。方法按GB/T 46869—2025附录A的优先顺序选用：具备清查/样地资料时采用生物量法；具备长期本地参数时采用固碳速率法；具备呼吸项资料时采用NEP法。若仅具备NPP，只能作为过程代理变量，不进入正式固碳价值量。不同生态系统类型分别建模，避免重复计量；价值参数明确碳价或替代成本、适用年份、折算方法和版本。</w:t>
       </w:r>
     </w:p>
     <w:p>
@@ -786,7 +827,7 @@
           <w:b w:val="0"/>
           <w:sz w:val="24"/>
         </w:rPr>
-        <w:t>2. 洪水调蓄服务模块。实物量口径为调蓄水量（m3/a）。以不透水面、绿地、水体和地形为精细空间证据，结合降雨、土壤、管网边界、排水分区和子汇水区，采用明确的水文模型计算。项目启动时固定设计暴雨情景、重现期、汇流边界和基础设施边界；模型须通过水量平衡、参数本地化和径流/积水资料验证。水文过程先在子汇水区或明确的排水单元计算，再汇总到海淀区，不能把像元结果简单相加。价值参数采用单位库容建设与运维替代成本，记录来源、价格年份和适用范围。</w:t>
+        <w:t>2. 洪水调蓄服务模块。实物量口径为调蓄水量（m3/a）。以不透水面、绿地、水体和地形为精细空间证据，结合降雨、土壤、管网边界、排水分区和子汇水区，采用水量平衡模型计算。年度量按经质量控制的降雨时段逐场计算后累加；设计暴雨及其重现期只用于极端情景检验，不直接替代年度量。以“维持现有灰色基础设施不变、将生态覆盖替换为相应非生态反事实”的差值定义生态系统贡献，管网、泵站、调蓄池等工程容量单列并剥离。模型须通过水量平衡、参数本地化和径流/积水资料验证。水文过程先在子汇水区或明确的排水单元计算，再汇总到海淀区，不能把像元结果简单相加。价值参数采用单位库容建设与运维替代成本，记录来源、价格年份和适用范围。</w:t>
       </w:r>
     </w:p>
     <w:p>
@@ -800,7 +841,7 @@
           <w:b w:val="0"/>
           <w:sz w:val="24"/>
         </w:rPr>
-        <w:t>3. 局部气候调节模块。以蒸散发调节温湿度所消耗的能量作为正式实物量口径，结合地表温度、植被、水体、不透水面、建筑环境和气象资料计算。采用明确的基准情景，区分地表温度、近地气温与热暴露；热暴露缓解作为补充效益，不能替代正式实物量。价值量按当地生活电价及替代制冷能耗核算，并记录服务对象、受益范围、价格年份和参数版本。</w:t>
+        <w:t>3. 局部气候调节模块。以蒸散发调节温湿度所消耗的能量作为正式实物量口径，采用潜热通量与蒸散发的能量换算关系计算。基准情景固定为“相同气象条件下，将绿地/水体替换为对应不透水面或裸地参考覆盖”；区分地表温度、近地气温与热暴露，热暴露缓解只作为补充效益。实物量通过独立温湿度站点或经校准的地表温度—气温关系验证；价值量按等效制冷能耗=热量/设备能效比换算，并采用当地生活电价，记录服务对象、受益范围、价格年份和参数版本。</w:t>
       </w:r>
     </w:p>
     <w:p>
@@ -828,7 +869,7 @@
           <w:b w:val="0"/>
           <w:sz w:val="24"/>
         </w:rPr>
-        <w:t>智能体采用“问—查—算—验—答”流程：解析问题后调用注册的数据、embedding、生态模型、标准参数和制图工具；输出专题图、统计表和文字结论；同时返回方法、输入版本、适用条件和不确定性。智能体不直接编造GEP数值，也不得绕过核算工具调用。</w:t>
+        <w:t>智能体采用“问—查—算—验—答”流程：解析问题后调用注册的数据、embedding、生态模型、标准参数和制图工具；输出专题图、统计表和文字结论；同时返回方法、输入版本、适用条件和不确定性。智能体不直接编造GEP数值，也不得绕过核算工具调用。验收设置不少于100条覆盖数据缺失、超出核算期、参数缺失和正常核算的测试问题：审计字段完整率应为100%，有工具支持的数值结论必须100%附带调用记录，缺失数据问题必须拒答或降级为定性说明；由生态核算责任人抽检不少于20条，复算结果与原记录一致。</w:t>
       </w:r>
     </w:p>
     <w:p>
@@ -1005,7 +1046,7 @@
           <w:b w:val="0"/>
           <w:sz w:val="24"/>
         </w:rPr>
-        <w:t>技术路线如下：多源月度影像与生态辅助数据 → 质量控制、时间匹配和10米网格对齐 → 玄女月度embedding与生态状态图 → 服务实物量模型与独立验证 → 标准化价值量核算 → 海淀区GEP汇总、专题图和可信问答。</w:t>
+        <w:t>技术路线如下：多源月度影像与生态辅助数据 → 质量控制、时间匹配和10米网格对齐 → 玄女月度embedding与生态状态图 → 服务实物量模型与独立验证 → 标准化价值量核算 → 三类调节服务价值试点汇总、专题图和可信问答。完整GEP汇总仅作为全部适用科目条件满足后的扩展成果。</w:t>
       </w:r>
     </w:p>
     <w:p>
@@ -1181,7 +1222,7 @@
           <w:b w:val="0"/>
           <w:sz w:val="24"/>
         </w:rPr>
-        <w:t>4. GEP核算工具链和可信问答原型，提供数据查询、模型运行、结果制图、报告导出和审计记录能力。</w:t>
+        <w:t>4. 三类调节服务价值试点核算工具链和可信问答原型，提供数据查询、模型运行、结果制图、试点报告导出和审计记录能力。</w:t>
       </w:r>
     </w:p>
     <w:p>
@@ -1223,6 +1264,20 @@
           <w:sz w:val="24"/>
         </w:rPr>
         <w:t>所有成果的空间分辨率、时间范围、资料来源、模型版本和适用条件应在产品说明中明确。立项后第2个月完成并冻结《核算边界、样本与验收方案》：分类产品按不少于5个空间块进行留出评价；连续变量按独立站点/样地和时间留出评价；洪水调蓄按预先选定的降雨事件或年度径流资料评价。每项服务均明确验证数据、校准/评价隔离、基线方法、合格判定、不确定性来源和复核责任。分类、连续变量和水文过程分别采用对应指标，不以单一R²或单一总体精度替代全过程评价。</w:t>
+      </w:r>
+    </w:p>
+    <w:p>
+      <w:pPr>
+        <w:spacing w:after="100" w:line="360" w:lineRule="auto"/>
+        <w:ind w:firstLine="420"/>
+      </w:pPr>
+      <w:r>
+        <w:rPr>
+          <w:rFonts w:ascii="Times New Roman" w:hAnsi="Times New Roman" w:eastAsia="宋体"/>
+          <w:b w:val="0"/>
+          <w:sz w:val="24"/>
+        </w:rPr>
+        <w:t>不确定性采用参数、驱动数据、土地覆盖、时相缺失和价值参数的情景分析或不少于1,000次蒙特卡洛抽样；分别报告三项服务实物量、价值量和试点合计的95%区间、主导敏感因子及空间相关性处理方法。完整GEP尚未满足条件时，不输出“完整GEP总值区间”。</w:t>
       </w:r>
     </w:p>
     <w:p>
@@ -1356,7 +1411,7 @@
           <w:b w:val="0"/>
           <w:sz w:val="24"/>
         </w:rPr>
-        <w:t>锁定核算基准年/核算期、海淀区行政边界版本、边界像元归属、生态系统分类、服务清单、数据来源、10米网格和质量控制规则；完成《核算边界、样本与验收方案》。若关键气象、水文、生态监测或价格资料无法取得，则触发Go/No-Go评审：缩减至具备资料的服务模块，不发布相应价值量。</w:t>
+        <w:t>锁定核算基准年/核算期、海淀区行政边界版本、边界像元归属、生态系统分类、服务清单、数据来源、10米网格和质量控制规则；完成《核算边界、样本与验收方案》。若关键气象、水文、生态监测或价格资料无法取得，则触发Go/No-Go评审：补齐资料后继续，或经项目管理方书面调整任务与验收；不得自行缩减三项核心服务，也不得用未经验证的价值量替代交付。</w:t>
       </w:r>
     </w:p>
     <w:p>
@@ -1410,7 +1465,7 @@
           <w:b w:val="0"/>
           <w:sz w:val="24"/>
         </w:rPr>
-        <w:t>完成三类服务的参数本地化、价值量计算、受益边界和区域外价值扣减规则；生成标准附录D、E所需的报告和表格字段，构建可追溯问答原型。</w:t>
+        <w:t>完成三类服务的参数本地化、价值量计算、受益边界和区域外价值扣减规则；生成按标准附录D、E字段组织的三服务试点报告与附表草案，明确其不是完整GEP正式核算报告；构建可追溯问答原型。</w:t>
       </w:r>
     </w:p>
     <w:p>

</xml_diff>

<commit_message>
docs: add GEP trial quality thresholds
</commit_message>
<xml_diff>
--- a/docs/projects/haidian_gep_xuannv_application_revision_20260729_zh.docx
+++ b/docs/projects/haidian_gep_xuannv_application_revision_20260729_zh.docx
@@ -841,7 +841,7 @@
           <w:b w:val="0"/>
           <w:sz w:val="24"/>
         </w:rPr>
-        <w:t>3. 局部气候调节模块。以蒸散发调节温湿度所消耗的能量作为正式实物量口径，采用潜热通量与蒸散发的能量换算关系计算。基准情景固定为“相同气象条件下，将绿地/水体替换为对应不透水面或裸地参考覆盖”；区分地表温度、近地气温与热暴露，热暴露缓解只作为补充效益。实物量通过独立温湿度站点或经校准的地表温度—气温关系验证；价值量按等效制冷能耗=热量/设备能效比换算，并采用当地生活电价，记录服务对象、受益范围、价格年份和参数版本。</w:t>
+        <w:t>3. 局部气候调节模块。以蒸散发调节温湿度所消耗的能量作为正式实物量口径，严格采用GB/T 46869—2025附录A.11。优先采用生态系统内外实测温差法：仅统计日均气温通常超过26℃的空调降温日，累计天数最多不超过4个月；数据不足时采用蒸散发法，分别核算植被蒸腾、水面在空调降温期间的蒸发和加湿期间的蒸发，空调与加湿天数由用电量序列分析得到。基准情景固定为“相同气象条件下，将绿地/水体替换为对应不透水面或裸地参考覆盖”；区分地表温度、近地气温与热暴露，热暴露缓解只作为补充效益。实物量通过独立温湿度站点或经校准的地表温度—气温关系验证；价值量按附录A.11的调节温湿度总能量乘当地生活电价核算，记录服务对象、受益范围、价格年份和参数版本。</w:t>
       </w:r>
     </w:p>
     <w:p>
@@ -1277,6 +1277,20 @@
           <w:b w:val="0"/>
           <w:sz w:val="24"/>
         </w:rPr>
+        <w:t>本技术试点的最低通过线为：生态系统分类总体精度不低于0.80、各基本生态系统类别F1不低于0.60；固定二氧化碳和局部气候调节的独立验证R²不低于0.50且绝对PBIAS不高于20%；洪水调蓄独立事件验证NSE不低于0.50且绝对PBIAS不高于20%；逐项价值量由独立复核人员复算，差异不高于1%。任一核心服务未达到上述门槛，只能以“方法验证结果”呈现，不得作为正式价值试点成果。所有阈值、样本数和基线方法在第2个月登记后不再自行调整。</w:t>
+      </w:r>
+    </w:p>
+    <w:p>
+      <w:pPr>
+        <w:spacing w:after="100" w:line="360" w:lineRule="auto"/>
+        <w:ind w:firstLine="420"/>
+      </w:pPr>
+      <w:r>
+        <w:rPr>
+          <w:rFonts w:ascii="Times New Roman" w:hAnsi="Times New Roman" w:eastAsia="宋体"/>
+          <w:b w:val="0"/>
+          <w:sz w:val="24"/>
+        </w:rPr>
         <w:t>不确定性采用参数、驱动数据、土地覆盖、时相缺失和价值参数的情景分析或不少于1,000次蒙特卡洛抽样；分别报告三项服务实物量、价值量和试点合计的95%区间、主导敏感因子及空间相关性处理方法。完整GEP尚未满足条件时，不输出“完整GEP总值区间”。</w:t>
       </w:r>
     </w:p>

</xml_diff>

<commit_message>
docs: clarify GEP trial capability and process boundaries
</commit_message>
<xml_diff>
--- a/docs/projects/haidian_gep_xuannv_application_revision_20260729_zh.docx
+++ b/docs/projects/haidian_gep_xuannv_application_revision_20260729_zh.docx
@@ -13,7 +13,7 @@
           <w:b/>
           <w:sz w:val="32"/>
         </w:rPr>
-        <w:t>基于玄女月度地理嵌入的海淀区生态系统生产总值（GEP）核算技术试点与智能服务研究</w:t>
+        <w:t>附件：海淀区生态系统调节服务价值核算技术试点实施与验收说明</w:t>
       </w:r>
     </w:p>
     <w:p>
@@ -97,7 +97,7 @@
                 <w:b w:val="0"/>
                 <w:sz w:val="21"/>
               </w:rPr>
-              <w:t>基于玄女月度地理嵌入的海淀区生态系统生产总值（GEP）核算技术试点与智能服务研究</w:t>
+              <w:t>附件：海淀区生态系统调节服务价值核算技术试点实施与验收说明</w:t>
             </w:r>
           </w:p>
         </w:tc>
@@ -308,7 +308,7 @@
           <w:b w:val="0"/>
           <w:sz w:val="24"/>
         </w:rPr>
-        <w:t>本项目面向海淀区GEP核算中数据分散、生态状态更新不及时和结果难以追溯等问题，建设“10米月度生态证据层—服务实物量反演—标准化价值量核算—可信服务”链条。玄女以1,280米×1,280米范围组织训练，每个patch输出128×128×64稠密embedding，实际对应10米网格，1,280米不是产品分辨率。项目依据GB/T 46869—2025，先开展固碳、洪水调蓄、局部气候调节三类调节服务价值试点；模型不直接预测货币，实物量和价值量由生态过程模型、监测资料、统计资料与标准参数共同核算，形成可追溯、可复算的示范成果。</w:t>
+        <w:t>本附件说明海淀区三类调节服务价值试点的实施与验收要求。玄女以1,280米×1,280米范围组织训练，每个数据范围输出128×128×64稠密嵌入，以名义10米等效分析网格表达地表状态；该网格用于面积、覆盖比例和空间分配，不代表10米生态过程观测或过程核算精度。固定二氧化碳、洪水调蓄和局部气候调节的实物量与价值量由国家标准方法、生态过程模型、监测资料、统计资料和价格参数共同核算。</w:t>
       </w:r>
     </w:p>
     <w:p>
@@ -348,7 +348,7 @@
           <w:b w:val="0"/>
           <w:sz w:val="24"/>
         </w:rPr>
-        <w:t>建立以10米月度生态状态embedding为证据层、以GB/T 46869—2025核算流程为约束的海淀区GEP核算技术试点。项目重点不是用人工智能端到端“预测人民币”，而是提高生态状态制图、服务实物量反演、数据对齐和过程调度的效率，使每项核算结果均可追溯到影像、模型、参数和统计资料。</w:t>
+        <w:t>建立以月度地表状态嵌入为辅助数据、以GB/T 46869—2025核算流程为约束的三类调节服务价值试点。嵌入用于生态系统类型、面积、覆盖比例和参数空间化；生态过程与价值量由专题模型、监测资料、统计资料和参数台账完成核算。</w:t>
       </w:r>
     </w:p>
     <w:p>
@@ -402,7 +402,7 @@
           <w:b w:val="0"/>
           <w:sz w:val="24"/>
         </w:rPr>
-        <w:t>项目已有玄女海淀月度embedding底座作为起点。P10C生产权重覆盖2025年12月至2026年5月、320个patch；对每个1,280米×1,280米patch输出128×128×64 embedding map，提供10米输出网格和64维表征。建筑、道路、水体仅在与预训练OSM弱语义同源的少样本基准上完成初步评测，尚未完成独立人工标注、生态监测或GEP服务变量验证。本项目将在此基础上补充DEM、气象、土壤、水文、地表温度、生态统计和监测资料，以生态过程模型和国家标准完成服务实物量及价值量试点核算。</w:t>
+        <w:t>项目已有玄女海淀月度嵌入基础作为起点。现有生产权重覆盖2025年12月至2026年5月、320个数据范围；对每个1,280米×1,280米数据范围输出128×128×64的名义10米等效分析网格。建筑、道路、水体结果使用与预训练开放地图弱语义同源的标签，属于内部制图验证，不作为生态服务或GEP核算精度依据。本项目将在此基础上补充DEM、气象、土壤、水文、地表温度、生态统计和监测资料，以生态过程模型和国家标准完成服务实物量及价值量试点核算。</w:t>
       </w:r>
     </w:p>
     <w:p>
@@ -552,7 +552,7 @@
           <w:b w:val="0"/>
           <w:sz w:val="24"/>
         </w:rPr>
-        <w:t>固定二氧化碳、洪水调蓄和局部气候调节均为项目必做模块，不允许因资料缺失自动缩减。第2个月的数据核查必须确认：固碳模块具备生态系统类型、气象、样地/清查或同等独立资料；洪水模块具备降雨、DEM、土壤、排水/汇水边界及不少于3场独立降雨—径流或积水事件资料；局部气候模块具备地表温度、气象、植被/不透水面资料和不少于3个季节的独立温湿度或能耗验证资料。资料不能满足时，项目管理方须作出“补充数据后继续”或“书面调整任务及验收”的决策，不能以无验证结果的价值量替代交付。</w:t>
+        <w:t>固定二氧化碳、洪水调蓄和局部气候调节均为项目必做模块，不允许因资料缺失自动缩减。第2个月的数据核查应形成“服务—实物量定义—主模型—过程单元—校准资料—独立验证资料—数据权属/取得日期—空间与时间代表性—参数来源—缺口处置”矩阵。固碳模块须具有支持年通量、年度增量或长期固碳速率的独立资料；洪水模块须具有同一代表性子汇水区的连续过程线或足够密集事件序列、排水边界和工程设施资料；局部气候模块须具有与正式核算路径一致的温湿度或蒸散发验证资料。未签署变更时，任一核心服务不能完成正式价值试点即判定项目未通过；经项目管理方签署变更后，须同步调整服务范围、成果、指标和经费，不得仍称为三服务价值试点。</w:t>
       </w:r>
     </w:p>
     <w:p>
@@ -566,7 +566,7 @@
           <w:b w:val="0"/>
           <w:sz w:val="24"/>
         </w:rPr>
-        <w:t>验收时，生态分类使用不少于5个空间分块的独立留出评价；连续变量每个服务模块至少使用30条独立观测或样地记录，并报告空间/时间代表性；洪水模块至少报告3场独立事件及年度水量平衡。每个产品必须覆盖经批准的基准年、保留100%完整的数据血缘字段；每项服务均与预先登记的传统过程模型或原始影像基线比较。数据不足时可交付“数据缺口与方法验证报告”，但不得命名为该服务的正式价值量成果。</w:t>
+        <w:t>验收时，生态分类使用不少于5个空间分块的独立留出评价，并报告各类别用户精度、生产者精度、面积偏差、边界误差和置信区间；连续变量按服务类型报告R²、MAE、RMSE、偏差、生态系统类型差异和置信区间；洪水模块分别报告事件过程和年度水量闭合。每个产品必须覆盖经批准的基准年，并保留完整的数据血缘字段、缺失值编码、源数据许可、版本保留期和不可复现外部数据处置记录。每项服务均与预先登记的同口径传统基线和统一验证集比较，报告嵌入产品的差异、置信区间和消融结果，不预设必须优于基线的结论。</w:t>
       </w:r>
     </w:p>
     <w:p>
@@ -675,7 +675,7 @@
           <w:b w:val="0"/>
           <w:sz w:val="24"/>
         </w:rPr>
-        <w:t>2. 生态状态层。形成与GB/T 46869—2025附录B生态系统分类相衔接的森林、灌丛、草地、湿地、农田和城市生态系统分类；城市生态系统进一步记录城市绿地、城市水体、居住地、工矿交通等子类。对分类图开展面积闭合、边界像元与混合像元处理，并使用独立样本评价。植被覆盖度、地表温度、热环境和变化图均属于本项目拟由专用头和外部资料生成的产品，不作为现有P10C已交付能力表述。</w:t>
+        <w:t>2. 生态状态层。形成与GB/T 46869—2025第4章和表3生态系统类型相衔接的森林、灌丛、草地、湿地、农田和城市生态系统分类；城市生态系统进一步记录城市绿地、城市水体、居住地、工矿交通等子类。对分类图开展面积闭合、边界像元与混合像元处理，并使用独立样本评价。植被覆盖度、地表温度、热环境和变化图均属于本项目拟由专题模型和外部资料生成的产品，不作为现有生产模型已交付能力表述。</w:t>
       </w:r>
     </w:p>
     <w:p>
@@ -730,7 +730,7 @@
           <w:b w:val="0"/>
           <w:sz w:val="24"/>
         </w:rPr>
-        <w:t>以玄女海淀P10C生产模型为初始化底座，保持其多源遥感输入、月度输出、128×128空间网格和64维稠密embedding能力。模型以六个月时序上下文生成对应月份的嵌入，因此应表述为“月度输出、具有时序上下文”，而非“每月只使用单月影像”。项目启动时需定义月产品采用回看窗口、居中窗口或其他规则，明确最短出具滞后、首尾月份处理、云缺失阈值和降级策略。</w:t>
+        <w:t>以玄女海淀现有生产模型为初始化底座，保持其多源遥感输入、月度输出、128×128空间网格和64维稠密嵌入能力。模型以六个月时序上下文生成对应月份的嵌入。现有模型已验证范围仅为2025年12月至2026年5月；2026自然年12期产品属于本项目新增数据、时序配置、再训练或适配、导出和独立验证成果。项目启动时需定义月产品的目标月、输入窗口、最短出具滞后、首尾月份处理、有效像元率、最小可用输入组合和降级策略；质量不满足核算要求的区域不进入价值量计算。</w:t>
       </w:r>
     </w:p>
     <w:p>
@@ -744,7 +744,7 @@
           <w:b w:val="0"/>
           <w:sz w:val="24"/>
         </w:rPr>
-        <w:t>在生态适配阶段引入DEM、坡度、气象、植被指数、地表温度等辅助变量，并设置质量感知的时空对齐和缺失处理机制。预训练和适配训练仍以多源重建、困难重建、质量掩膜和广义弱语义为主；不得将最终GEP金额、最终核算结果、价格参数或最终独立评价标签作为基础模型训练目标。OSM等开放数据只作为广义弱语义先验，不作为GEP服务的唯一真值。</w:t>
+        <w:t>在生态适配阶段引入DEM、坡度、气象、植被指数、地表温度等辅助变量，并设置质量感知的时空对齐和缺失处理机制。项目启动时冻结“特征—标签—过程驱动”数据契约：训练特征不得同时作为独立验证目标；过程模型驱动使用目标期可获得的数据；训练、验证按空间块、年份和数据源隔离。开放地图数据只作为广义弱语义先验，不作为GEP服务真值。</w:t>
       </w:r>
     </w:p>
     <w:p>
@@ -758,7 +758,7 @@
           <w:b w:val="0"/>
           <w:sz w:val="24"/>
         </w:rPr>
-        <w:t>现有P10C导出结果为embedding及其全局元数据，不直接输出逐patch、逐月质量信息或生态状态图；现有高分源还采用跨可用时相汇聚后逐月重复融合，不能称为同期高分观测。项目拟改造为按目标月匹配的高分融合，并发布独立的月度产品包：embedding、输入可用性、云/阴影等质量掩膜、源数据日期、空间参考、处理版本和不确定性字段。无同期高分观测时应按规则降级并记录，不以相邻月份影像冒充同期观测。</w:t>
+        <w:t>现有生产模型导出结果为嵌入及其全局元数据，不直接输出逐数据范围、逐月质量信息或生态状态图；现有高分源采用跨可用时相汇聚后逐月重复融合，不属于目标月同期高分观测。项目拟将单帧高分输入改造为按目标月组织的时序高分输入与掩膜，并重新训练、导出和验证，现有权重不能通过后处理直接获得该能力。项目启动时冻结质量数据字典，区分观测质量与模型不确定性，记录逐源云、阴影、无数据掩膜、获取日期、目标月时间差、可用性、降级原因、重采样方法和月产品有效标志；模型不确定性另行说明计算方法、校准资料和适用范围。</w:t>
       </w:r>
     </w:p>
     <w:p>
@@ -785,7 +785,7 @@
           <w:b w:val="0"/>
           <w:sz w:val="24"/>
         </w:rPr>
-        <w:t>按照GB/T 46869—2025，GEP核算应依次完成核算区域与生态系统类型确定、生态产品清单确定、数据收集、实物量核算、价值量核算和总值汇总。正式核算前锁定自然年或明确核算期、行政边界版本、边界像元归属和水体范围；月度embedding只作为状态证据，不能把月度存量或状态简单累加为年度实物量。玄女embedding的角色是提高生态状态表达与空间细化能力，不取代生态过程模型、标准公式、统计口径和价值参数。</w:t>
+        <w:t>按照GB/T 46869—2025，GEP核算应依次完成核算区域与生态系统类型确定、生态产品清单确定、数据收集、实物量核算、价值量核算和总值汇总。正式核算前锁定自然年或明确核算期、行政边界版本、边界像元归属和水体范围；月度嵌入只用于状态表达、面积和覆盖比例空间分配，不能把月度状态简单累加为年度实物量。固碳按生态斑块或清查单元、洪水调蓄按子汇水区、局部气候调节按绿地斑块及影响范围计算；嵌入不替代生物量、蒸散发、径流或近地气温观测。</w:t>
       </w:r>
     </w:p>
     <w:p>
@@ -813,7 +813,7 @@
           <w:b w:val="0"/>
           <w:sz w:val="24"/>
         </w:rPr>
-        <w:t>1. 固碳服务模块。实物量口径为固定二氧化碳量（tCO2/a）。以10米生态状态证据辅助植被类型与空间化，但不把NPP直接等同于净碳汇。方法按GB/T 46869—2025附录A的优先顺序选用：具备清查/样地资料时采用生物量法；具备长期本地参数时采用固碳速率法；具备呼吸项资料时采用NEP法。若仅具备NPP，只能作为过程代理变量，不进入正式固碳价值量。不同生态系统类型分别建模，避免重复计量；价值参数明确碳价或替代成本、适用年份、折算方法和版本。</w:t>
+        <w:t>1. 固碳服务模块。实物量口径为固定二氧化碳量（tCO2/a）。以嵌入产品辅助植被类型、面积和空间分配，不把NPP直接等同于净碳汇。方法按GB/T 46869—2025附录A.7的优先顺序选用：具备相邻年份清查/复测资料时采用生物量法；具备长期本地参数时采用固碳速率法；具备异养呼吸或NPP—NEP转换资料时采用NEP法。各生态系统类型预先锁定一种主核算路径和相应的年度增量、年通量或长期速率独立验证对象；仅验证NPP或生物量时，不发布年度固定二氧化碳价值量。价值参数明确碳价或替代成本、适用年份、折算方法和版本。</w:t>
       </w:r>
     </w:p>
     <w:p>
@@ -827,7 +827,7 @@
           <w:b w:val="0"/>
           <w:sz w:val="24"/>
         </w:rPr>
-        <w:t>2. 洪水调蓄服务模块。实物量口径为调蓄水量（m3/a）。以不透水面、绿地、水体和地形为精细空间证据，结合降雨、土壤、管网边界、排水分区和子汇水区，采用水量平衡模型计算。年度量按经质量控制的降雨时段逐场计算后累加；设计暴雨及其重现期只用于极端情景检验，不直接替代年度量。以“维持现有灰色基础设施不变、将生态覆盖替换为相应非生态反事实”的差值定义生态系统贡献，管网、泵站、调蓄池等工程容量单列并剥离。模型须通过水量平衡、参数本地化和径流/积水资料验证。水文过程先在子汇水区或明确的排水单元计算，再汇总到海淀区，不能把像元结果简单相加。价值参数采用单位库容建设与运维替代成本，记录来源、价格年份和适用范围。</w:t>
+        <w:t>2. 洪水调蓄服务模块。正式试点量按照GB/T 46869—2025附录A.6核算植被、库区、湖泊、沼泽和水田等生态系统的洪水调蓄量及价值量，明确暴雨降水、暴雨径流量、生态系统面积和参数来源。城市生态覆盖增量雨洪效益采用子汇水区水量平衡和反事实方法单独分析，维持灰色基础设施不变，管网、泵站、调蓄池等工程容量单列并剥离；该补充结果不与标准核算量相加。年度水量按连续过程线或具代表性的事件序列计算并进行年度水量闭合，分别报告体积、峰值、峰现时间和淹没范围；资料不足时仅发布情景减排量，不发布正式年度调蓄价值。</w:t>
       </w:r>
     </w:p>
     <w:p>
@@ -841,7 +841,7 @@
           <w:b w:val="0"/>
           <w:sz w:val="24"/>
         </w:rPr>
-        <w:t>3. 局部气候调节模块。以蒸散发调节温湿度所消耗的能量作为正式实物量口径，严格采用GB/T 46869—2025附录A.11。优先采用生态系统内外实测温差法：仅统计日均气温通常超过26℃的空调降温日，累计天数最多不超过4个月；数据不足时采用蒸散发法，分别核算植被蒸腾、水面在空调降温期间的蒸发和加湿期间的蒸发，空调与加湿天数由用电量序列分析得到。基准情景固定为“相同气象条件下，将绿地/水体替换为对应不透水面或裸地参考覆盖”；区分地表温度、近地气温与热暴露，热暴露缓解只作为补充效益。实物量通过独立温湿度站点或经校准的地表温度—气温关系验证；价值量按附录A.11的调节温湿度总能量乘当地生活电价核算，记录服务对象、受益范围、价格年份和参数版本。</w:t>
+        <w:t>3. 局部气候调节模块。正式价值量按照GB/T 46869—2025附录A.11，以生态系统内外实测温差或蒸散发消耗能量为实物量口径。优先采用实测温差法；数据不足时采用蒸散发法，分别核算植被蒸腾、水面在空调降温期间的蒸发和加湿期间的蒸发，按标准规定的适用时段和参数处理。地表温度、近地气温、热暴露和建筑节能效益分列为补充观测或协同效益，不替代正式实物量和价值量；其空间化验证采用匹配的生态系统内外温湿度观测、对照样地和气象条件控制。</w:t>
       </w:r>
     </w:p>
     <w:p>
@@ -924,7 +924,7 @@
           <w:b w:val="0"/>
           <w:sz w:val="24"/>
         </w:rPr>
-        <w:t>2. 服务实物量产品。按像元或适当的子汇水区、绿地斑块等过程单元计算固碳、雨洪调蓄和热环境调节服务，再按街道或行政区进行汇总。</w:t>
+        <w:t>2. 服务实物量产品。按生态斑块、子汇水区、绿地斑块及影响范围等过程单元计算固定二氧化碳、洪水调蓄和局部气候调节服务，再按街道或行政区进行汇总。</w:t>
       </w:r>
     </w:p>
     <w:p>
@@ -1005,7 +1005,7 @@
           <w:b w:val="0"/>
           <w:sz w:val="24"/>
         </w:rPr>
-        <w:t>采用“冻结或轻量适配的embedding底座＋服务专用轻量头＋生态过程模型”的组合，而非以黑盒网络直接预测价值量。embedding负责可迁移地表语义和精细边界表达；服务头负责从生态状态映射至过程变量；CASA、InVEST或经验证的本地模型负责实物量计算。</w:t>
+        <w:t>采用基础模型、专题模型和生态过程模型协同的组合。嵌入用于地表状态、面积、覆盖比例和参数空间化；专题模型和标准过程方法负责实物量计算；价值量依据标准参数和台账完成核算。</w:t>
       </w:r>
     </w:p>
     <w:p>
@@ -1180,7 +1180,7 @@
           <w:b w:val="0"/>
           <w:sz w:val="24"/>
         </w:rPr>
-        <w:t>1. 海淀区10米月度生态证据产品和数据字典，包括embedding、质量掩膜、生态状态图和数据血缘信息。现有P10C结果将作为基线；逐patch、逐月质量元数据和生态状态图为本项目新增交付。</w:t>
+        <w:t>1. 海淀区名义10米等效分析网格的月度地表状态产品和数据字典，包括嵌入、质量掩膜、生态状态图和数据血缘信息。现有生产结果作为基线；逐数据范围、逐月质量元数据和生态状态图为本项目新增交付。</w:t>
       </w:r>
     </w:p>
     <w:p>
@@ -1277,7 +1277,7 @@
           <w:b w:val="0"/>
           <w:sz w:val="24"/>
         </w:rPr>
-        <w:t>本技术试点的最低通过线为：生态系统分类总体精度不低于0.80、各基本生态系统类别F1不低于0.60；固定二氧化碳和局部气候调节的独立验证R²不低于0.50且绝对PBIAS不高于20%；洪水调蓄独立事件验证NSE不低于0.50且绝对PBIAS不高于20%；逐项价值量由独立复核人员复算，差异不高于1%。任一核心服务未达到上述门槛，只能以“方法验证结果”呈现，不得作为正式价值试点成果。所有阈值、样本数和基线方法在第2个月登记后不再自行调整。</w:t>
+        <w:t>本技术试点的最低通过线按服务、目标变量和独立样本设计分别登记：生态系统分类总体精度不低于0.80、各基本生态系统类别F1不低于0.60，罕见类别单列样本量与置信区间；连续变量同时评价R²、MAE、RMSE、偏差和空间/季节差异；洪水调蓄分别对事件过程和年度水量判定，不以少量事件的NSE代替年度验证。逐项价值量在同一冻结输入、参数和舍入规则下由独立复核人员复算，差异不高于1%，该指标仅反映计算复现性。任一核心服务未达到其登记门槛，只能以“方法验证结果”呈现，不得作为正式价值试点成果。</w:t>
       </w:r>
     </w:p>
     <w:p>
@@ -1291,7 +1291,7 @@
           <w:b w:val="0"/>
           <w:sz w:val="24"/>
         </w:rPr>
-        <w:t>不确定性采用参数、驱动数据、土地覆盖、时相缺失和价值参数的情景分析或不少于1,000次蒙特卡洛抽样；分别报告三项服务实物量、价值量和试点合计的95%区间、主导敏感因子及空间相关性处理方法。完整GEP尚未满足条件时，不输出“完整GEP总值区间”。</w:t>
+        <w:t>不确定性采用参数、驱动数据、土地覆盖、时相缺失和价值参数的情景分析或蒙特卡洛抽样；默认不少于1,000次，或以区间收敛诊断证明较少抽样次数充分，并保留随机种子、分布假设、参数相关性和空间相关性处理方法。分别报告三项服务实物量、价值量和试点合计的95%区间及主导敏感因子。完整GEP尚未满足条件时，不输出“完整GEP总值区间”。</w:t>
       </w:r>
     </w:p>
     <w:p>
@@ -1358,7 +1358,7 @@
           <w:b w:val="0"/>
           <w:sz w:val="24"/>
         </w:rPr>
-        <w:t>玄女海淀P10C生产模型已形成月度多源遥感embedding能力：输入由Sentinel-2、Sentinel-1、Landsat、高分光学和高分SAR等组成；在2025年12月至2026年5月、320个patch范围内输出128×128×64的10米稠密embedding map。现有建筑、道路、水体结果来自与预训练OSM弱语义同源的少样本基准，说明其具有地表表征和快速适配潜力，但不能作为独立生态服务反演精度或GEP核算能力的证据。</w:t>
+        <w:t>玄女海淀现有生产模型已形成月度多源遥感嵌入能力：输入由Sentinel-2、Sentinel-1、Landsat、高分光学和高分SAR等组成；在2025年12月至2026年5月、320个数据范围内输出128×128×64的名义10米等效分析网格。现有建筑、道路、水体结果使用与预训练开放地图弱语义同源的二值标签，属于同源弱标签下的内部可分性和快速制图验证；其只能说明模型对这些开放地图定义类别具有可用表征，不构成独立人工真值、生态状态分类、生态服务反演或GEP核算精度的证据。</w:t>
       </w:r>
     </w:p>
     <w:p>
@@ -1425,7 +1425,7 @@
           <w:b w:val="0"/>
           <w:sz w:val="24"/>
         </w:rPr>
-        <w:t>锁定核算基准年/核算期、海淀区行政边界版本、边界像元归属、生态系统分类、服务清单、数据来源、10米网格和质量控制规则；完成《核算边界、样本与验收方案》。若关键气象、水文、生态监测或价格资料无法取得，则触发Go/No-Go评审：补齐资料后继续，或经项目管理方书面调整任务与验收；不得自行缩减三项核心服务，也不得用未经验证的价值量替代交付。</w:t>
+        <w:t>锁定核算基准年/核算期、海淀区行政边界版本、边界像元归属、生态系统分类、服务清单、数据来源、名义10米等效分析网格和质量控制规则；完成《核算边界、样本与验收方案》。若关键气象、水文、生态监测或价格资料无法取得，由项目管理方书面决定补充数据或同步调整服务范围、成果、指标和经费；不得以未经验证的价值量替代交付。</w:t>
       </w:r>
     </w:p>
     <w:p>

</xml_diff>